<commit_message>
CEO Clickable summary cards
</commit_message>
<xml_diff>
--- a/Troubleshooting and Test.docx
+++ b/Troubleshooting and Test.docx
@@ -2,6 +2,7 @@
 <file path=word/document.xml><?xml version="1.0" encoding="utf-8"?>
 <w:document xmlns:wpc="http://schemas.microsoft.com/office/word/2010/wordprocessingCanvas" xmlns:cx="http://schemas.microsoft.com/office/drawing/2014/chartex" xmlns:cx1="http://schemas.microsoft.com/office/drawing/2015/9/8/chartex" xmlns:cx2="http://schemas.microsoft.com/office/drawing/2015/10/21/chartex" xmlns:cx3="http://schemas.microsoft.com/office/drawing/2016/5/9/chartex" xmlns:cx4="http://schemas.microsoft.com/office/drawing/2016/5/10/chartex" xmlns:cx5="http://schemas.microsoft.com/office/drawing/2016/5/11/chartex" xmlns:cx6="http://schemas.microsoft.com/office/drawing/2016/5/12/chartex" xmlns:cx7="http://schemas.microsoft.com/office/drawing/2016/5/13/chartex" xmlns:cx8="http://schemas.microsoft.com/office/drawing/2016/5/14/chartex" xmlns:mc="http://schemas.openxmlformats.org/markup-compatibility/2006" xmlns:aink="http://schemas.microsoft.com/office/drawing/2016/ink" xmlns:am3d="http://schemas.microsoft.com/office/drawing/2017/model3d" xmlns:o="urn:schemas-microsoft-com:office:office" xmlns:oel="http://schemas.microsoft.com/office/2019/extlst" xmlns:r="http://schemas.openxmlformats.org/officeDocument/2006/relationships" xmlns:m="http://schemas.openxmlformats.org/officeDocument/2006/math" xmlns:v="urn:schemas-microsoft-com:vml" xmlns:wp14="http://schemas.microsoft.com/office/word/2010/wordprocessingDrawing" xmlns:wp="http://schemas.openxmlformats.org/drawingml/2006/wordprocessingDrawing" xmlns:w10="urn:schemas-microsoft-com:office:word" xmlns:w="http://schemas.openxmlformats.org/wordprocessingml/2006/main" xmlns:w14="http://schemas.microsoft.com/office/word/2010/wordml" xmlns:w15="http://schemas.microsoft.com/office/word/2012/wordml" xmlns:w16cex="http://schemas.microsoft.com/office/word/2018/wordml/cex" xmlns:w16cid="http://schemas.microsoft.com/office/word/2016/wordml/cid" xmlns:w16="http://schemas.microsoft.com/office/word/2018/wordml" xmlns:w16du="http://schemas.microsoft.com/office/word/2023/wordml/word16du" xmlns:w16sdtdh="http://schemas.microsoft.com/office/word/2020/wordml/sdtdatahash" xmlns:w16sdtfl="http://schemas.microsoft.com/office/word/2024/wordml/sdtformatlock" xmlns:w16se="http://schemas.microsoft.com/office/word/2015/wordml/symex" xmlns:wpg="http://schemas.microsoft.com/office/word/2010/wordprocessingGroup" xmlns:wpi="http://schemas.microsoft.com/office/word/2010/wordprocessingInk" xmlns:wne="http://schemas.microsoft.com/office/word/2006/wordml" xmlns:wps="http://schemas.microsoft.com/office/word/2010/wordprocessingShape" mc:Ignorable="w14 w15 w16se w16cid w16 w16cex w16sdtdh w16sdtfl w16du wp14">
   <w:body>
+    <w:p/>
     <w:p>
       <w:r>
         <w:t xml:space="preserve">As a HR manager and admin of this system I want to be able to see the password of the employee in order to </w:t>
@@ -9,7 +10,17 @@
     </w:p>
     <w:p>
       <w:r>
-        <w:t xml:space="preserve">Here in the employee page when I want to add an employee under the HR manager I cant as it is not </w:t>
+        <w:t xml:space="preserve">Here in the employee page when I want to add an employee under the HR manager I </w:t>
+      </w:r>
+      <w:proofErr w:type="spellStart"/>
+      <w:proofErr w:type="gramStart"/>
+      <w:r>
+        <w:t>cant</w:t>
+      </w:r>
+      <w:proofErr w:type="spellEnd"/>
+      <w:proofErr w:type="gramEnd"/>
+      <w:r>
+        <w:t xml:space="preserve"> as it is not </w:t>
       </w:r>
     </w:p>
     <w:p>
@@ -57,7 +68,31 @@
     <w:p/>
     <w:p>
       <w:r>
-        <w:t>How is the hr manager going to see the employees uder him from the mobile when the hr department employees try to login or request leaves please explain it</w:t>
+        <w:t xml:space="preserve">How is the </w:t>
+      </w:r>
+      <w:proofErr w:type="spellStart"/>
+      <w:r>
+        <w:t>hr</w:t>
+      </w:r>
+      <w:proofErr w:type="spellEnd"/>
+      <w:r>
+        <w:t xml:space="preserve"> manager going to see the employees </w:t>
+      </w:r>
+      <w:proofErr w:type="spellStart"/>
+      <w:r>
+        <w:t>uder</w:t>
+      </w:r>
+      <w:proofErr w:type="spellEnd"/>
+      <w:r>
+        <w:t xml:space="preserve"> him from the mobile when the </w:t>
+      </w:r>
+      <w:proofErr w:type="spellStart"/>
+      <w:r>
+        <w:t>hr</w:t>
+      </w:r>
+      <w:proofErr w:type="spellEnd"/>
+      <w:r>
+        <w:t xml:space="preserve"> department employees try to login or request leaves please explain it</w:t>
       </w:r>
     </w:p>
     <w:p>
@@ -76,12 +111,21 @@
     <w:p/>
     <w:p>
       <w:r>
-        <w:t xml:space="preserve">I have created new manager and employee under him when the employee checks in the hr manager can see it from the application but the manager sees him as absent </w:t>
-      </w:r>
-    </w:p>
-    <w:p/>
-    <w:p>
-      <w:r>
+        <w:t xml:space="preserve">I have created new manager and employee under him when the employee checks in the </w:t>
+      </w:r>
+      <w:proofErr w:type="spellStart"/>
+      <w:r>
+        <w:t>hr</w:t>
+      </w:r>
+      <w:proofErr w:type="spellEnd"/>
+      <w:r>
+        <w:t xml:space="preserve"> manager can see it from the application but the manager sees him as absent </w:t>
+      </w:r>
+    </w:p>
+    <w:p/>
+    <w:p>
+      <w:r>
+        <w:lastRenderedPageBreak/>
         <w:t>Now I want you to check the login check in process as for now I can use the same user pass with multiple mobile phone and this is not correct as each employee need to check in himself not another college checking in for him</w:t>
       </w:r>
     </w:p>
@@ -106,7 +150,23 @@
     <w:p/>
     <w:p>
       <w:r>
-        <w:t>Vacations balance is not in the hr portal I need it to be visible to hr manager in order to check</w:t>
+        <w:t xml:space="preserve">Vacations balance is not in the </w:t>
+      </w:r>
+      <w:proofErr w:type="spellStart"/>
+      <w:r>
+        <w:t>hr</w:t>
+      </w:r>
+      <w:proofErr w:type="spellEnd"/>
+      <w:r>
+        <w:t xml:space="preserve"> portal I need it to be visible to </w:t>
+      </w:r>
+      <w:proofErr w:type="spellStart"/>
+      <w:r>
+        <w:t>hr</w:t>
+      </w:r>
+      <w:proofErr w:type="spellEnd"/>
+      <w:r>
+        <w:t xml:space="preserve"> manager in order to check</w:t>
       </w:r>
     </w:p>
     <w:p>
@@ -116,13 +176,34 @@
     </w:p>
     <w:p/>
     <w:p>
-      <w:r>
-        <w:t>Also for the employees app there are a lot of mobile phones that the fingerprint is not on the screen and when they try to connect it doesn’t register what can we do</w:t>
-      </w:r>
-    </w:p>
-    <w:p>
-      <w:r>
-        <w:t>The language icon when I login from the mobile it is not visible I have to be able to change it after I login</w:t>
+      <w:proofErr w:type="gramStart"/>
+      <w:r>
+        <w:t>Also</w:t>
+      </w:r>
+      <w:proofErr w:type="gramEnd"/>
+      <w:r>
+        <w:t xml:space="preserve"> for the </w:t>
+      </w:r>
+      <w:proofErr w:type="gramStart"/>
+      <w:r>
+        <w:t>employees</w:t>
+      </w:r>
+      <w:proofErr w:type="gramEnd"/>
+      <w:r>
+        <w:t xml:space="preserve"> app there are a lot of mobile phones that the fingerprint is not on the screen and when they try to connect it doesn’t register what can we do</w:t>
+      </w:r>
+    </w:p>
+    <w:p>
+      <w:r>
+        <w:t xml:space="preserve">The language icon when I login from the mobile it is not </w:t>
+      </w:r>
+      <w:proofErr w:type="gramStart"/>
+      <w:r>
+        <w:t>visible</w:t>
+      </w:r>
+      <w:proofErr w:type="gramEnd"/>
+      <w:r>
+        <w:t xml:space="preserve"> I have to be able to change it after I login</w:t>
       </w:r>
     </w:p>
     <w:p/>
@@ -145,17 +226,25 @@
       <w:r>
         <w:t>*</w:t>
       </w:r>
+      <w:proofErr w:type="gramStart"/>
       <w:r>
         <w:t>done</w:t>
       </w:r>
-    </w:p>
-    <w:p>
-      <w:r>
-        <w:t xml:space="preserve">Also I want to add 2 more positions that have access to see all attendance like the manager screen but I want their view to show each manager and his team status </w:t>
-      </w:r>
-    </w:p>
-    <w:p>
-      <w:r>
+      <w:proofErr w:type="gramEnd"/>
+    </w:p>
+    <w:p>
+      <w:proofErr w:type="gramStart"/>
+      <w:r>
+        <w:t>Also</w:t>
+      </w:r>
+      <w:proofErr w:type="gramEnd"/>
+      <w:r>
+        <w:t xml:space="preserve"> I want to add 2 more positions that have access to see all attendance like the manager screen but I want their view to show each manager and his team status </w:t>
+      </w:r>
+    </w:p>
+    <w:p>
+      <w:r>
+        <w:lastRenderedPageBreak/>
         <w:t>CEO and Managing Director both have the same views but no need for then to attend, let me know what would it take to add this option also if you have any other points to add for them</w:t>
       </w:r>
     </w:p>
@@ -177,9 +266,11 @@
       <w:r>
         <w:t>*</w:t>
       </w:r>
+      <w:proofErr w:type="gramStart"/>
       <w:r>
         <w:t>done</w:t>
       </w:r>
+      <w:proofErr w:type="gramEnd"/>
     </w:p>
     <w:p>
       <w:r>
@@ -202,9 +293,11 @@
       <w:r>
         <w:t>*</w:t>
       </w:r>
+      <w:proofErr w:type="gramStart"/>
       <w:r>
         <w:t>done</w:t>
       </w:r>
+      <w:proofErr w:type="gramEnd"/>
     </w:p>
     <w:p>
       <w:r>
@@ -218,7 +311,15 @@
     </w:p>
     <w:p>
       <w:r>
-        <w:t>One manager can access his own attendance button but cannot submit his attendance and the phone is giving poor gps although other employees can register their attendance</w:t>
+        <w:t xml:space="preserve">One manager can access his own attendance button but cannot submit his attendance and the phone is giving poor </w:t>
+      </w:r>
+      <w:proofErr w:type="spellStart"/>
+      <w:r>
+        <w:t>gps</w:t>
+      </w:r>
+      <w:proofErr w:type="spellEnd"/>
+      <w:r>
+        <w:t xml:space="preserve"> although other employees can register their attendance</w:t>
       </w:r>
     </w:p>
     <w:p>
@@ -227,6 +328,14 @@
       </w:r>
     </w:p>
     <w:p/>
+    <w:p/>
+    <w:p/>
+    <w:p/>
+    <w:p>
+      <w:r>
+        <w:t>Check attached screens, I don’t know why the output report is giving that all are absent although they are present in the system</w:t>
+      </w:r>
+    </w:p>
     <w:sectPr>
       <w:pgSz w:w="12240" w:h="15840"/>
       <w:pgMar w:top="1440" w:right="1440" w:bottom="1440" w:left="1440" w:header="720" w:footer="720" w:gutter="0"/>

</xml_diff>